<commit_message>
correction refs #4 #8
</commit_message>
<xml_diff>
--- a/manuel chemin le plus court.docx
+++ b/manuel chemin le plus court.docx
@@ -182,7 +182,7 @@
                 <w:sz w:val="28"/>
                 <w:szCs w:val="28"/>
               </w:rPr>
-              <w:t>2</w:t>
+              <w:t>3</w:t>
             </w:r>
             <w:r>
               <w:rPr>
@@ -233,7 +233,7 @@
                 <w:sz w:val="28"/>
                 <w:szCs w:val="28"/>
               </w:rPr>
-              <w:t>28/0</w:t>
+              <w:t>07</w:t>
             </w:r>
             <w:r>
               <w:rPr>
@@ -243,7 +243,17 @@
                 <w:sz w:val="28"/>
                 <w:szCs w:val="28"/>
               </w:rPr>
-              <w:t>1</w:t>
+              <w:t>/0</w:t>
+            </w:r>
+            <w:r>
+              <w:rPr>
+                <w:rFonts w:ascii="Times New Roman" w:hAnsi="Times New Roman" w:cs="Times New Roman"/>
+                <w:b/>
+                <w:noProof/>
+                <w:sz w:val="28"/>
+                <w:szCs w:val="28"/>
+              </w:rPr>
+              <w:t>5</w:t>
             </w:r>
             <w:r>
               <w:rPr>
@@ -308,24 +318,6 @@
     </w:tbl>
     <w:p>
       <w:pPr>
-        <w:ind w:firstLine="397"/>
-        <w:rPr>
-          <w:rFonts w:eastAsia="Times New Roman" w:cs="Times New Roman"/>
-          <w:sz w:val="16"/>
-        </w:rPr>
-      </w:pPr>
-    </w:p>
-    <w:p>
-      <w:pPr>
-        <w:ind w:firstLine="397"/>
-        <w:rPr>
-          <w:rFonts w:eastAsia="Times New Roman" w:cs="Times New Roman"/>
-          <w:sz w:val="16"/>
-        </w:rPr>
-      </w:pPr>
-    </w:p>
-    <w:p>
-      <w:pPr>
         <w:rPr>
           <w:rFonts w:eastAsia="Times New Roman" w:cs="Times New Roman"/>
           <w:sz w:val="20"/>
@@ -395,7 +387,15 @@
         </w:numPr>
       </w:pPr>
       <w:r>
-        <w:t xml:space="preserve">Il fonctionne dans n’importe quel projet quelles que soient les données (vecteur ou flux wfs). </w:t>
+        <w:t xml:space="preserve">Il fonctionne dans n’importe quel projet quelles que soient les données (vecteur ou flux </w:t>
+      </w:r>
+      <w:proofErr w:type="spellStart"/>
+      <w:r>
+        <w:t>wfs</w:t>
+      </w:r>
+      <w:proofErr w:type="spellEnd"/>
+      <w:r>
+        <w:t xml:space="preserve">). </w:t>
       </w:r>
     </w:p>
     <w:bookmarkEnd w:id="1"/>
@@ -421,13 +421,25 @@
         <w:ind w:left="432"/>
       </w:pPr>
       <w:r>
-        <w:t>Ouvrir QGIS.</w:t>
+        <w:t>2 possibilités :</w:t>
       </w:r>
     </w:p>
     <w:p>
       <w:pPr>
         <w:ind w:left="432"/>
       </w:pPr>
+    </w:p>
+    <w:p>
+      <w:pPr>
+        <w:pStyle w:val="Paragraphedeliste"/>
+        <w:numPr>
+          <w:ilvl w:val="0"/>
+          <w:numId w:val="50"/>
+        </w:numPr>
+      </w:pPr>
+      <w:r>
+        <w:t xml:space="preserve">Ouvrir QGIS, </w:t>
+      </w:r>
       <w:r>
         <w:t xml:space="preserve">Allez dans </w:t>
       </w:r>
@@ -438,20 +450,29 @@
         <w:t>ier ZIP puis cliquez sur Installer le plugin.</w:t>
       </w:r>
     </w:p>
-    <w:p/>
     <w:p>
-      <w:r>
-        <w:rPr>
-          <w:noProof/>
-        </w:rPr>
-        <w:t xml:space="preserve">                      </w:t>
-      </w:r>
+      <w:pPr>
+        <w:pStyle w:val="Paragraphedeliste"/>
+        <w:ind w:left="792"/>
+      </w:pPr>
+    </w:p>
+    <w:p>
+      <w:pPr>
+        <w:pStyle w:val="Paragraphedeliste"/>
+        <w:ind w:left="792"/>
+      </w:pPr>
+    </w:p>
+    <w:p>
+      <w:pPr>
+        <w:pStyle w:val="Paragraphedeliste"/>
+        <w:ind w:left="792"/>
+      </w:pPr>
       <w:r>
         <w:rPr>
           <w:noProof/>
         </w:rPr>
         <w:drawing>
-          <wp:inline distT="0" distB="0" distL="0" distR="0" wp14:anchorId="6EB7B44B" wp14:editId="485B399C">
+          <wp:inline distT="0" distB="0" distL="0" distR="0" wp14:anchorId="6136AB42" wp14:editId="0954DDCB">
             <wp:extent cx="4752975" cy="1059863"/>
             <wp:effectExtent l="0" t="0" r="0" b="6985"/>
             <wp:docPr id="8" name="Image 8"/>
@@ -487,8 +508,41 @@
         </w:drawing>
       </w:r>
     </w:p>
+    <w:p>
+      <w:pPr>
+        <w:pStyle w:val="Paragraphedeliste"/>
+        <w:ind w:left="792"/>
+      </w:pPr>
+    </w:p>
+    <w:p>
+      <w:pPr>
+        <w:pStyle w:val="Paragraphedeliste"/>
+        <w:numPr>
+          <w:ilvl w:val="0"/>
+          <w:numId w:val="50"/>
+        </w:numPr>
+      </w:pPr>
+      <w:r>
+        <w:t>Installation via l’installateur (*_</w:t>
+      </w:r>
+      <w:proofErr w:type="spellStart"/>
+      <w:r>
+        <w:t>PluginIGN_Installer</w:t>
+      </w:r>
+      <w:proofErr w:type="spellEnd"/>
+      <w:r>
+        <w:t>)</w:t>
+      </w:r>
+    </w:p>
     <w:p/>
-    <w:p/>
+    <w:p>
+      <w:r>
+        <w:rPr>
+          <w:noProof/>
+        </w:rPr>
+        <w:t xml:space="preserve">                      </w:t>
+      </w:r>
+    </w:p>
     <w:p>
       <w:pPr>
         <w:pStyle w:val="Titre1"/>
@@ -643,8 +697,6 @@
         <w:t>de la barre de menus.</w:t>
       </w:r>
     </w:p>
-    <w:p/>
-    <w:p/>
     <w:p>
       <w:pPr>
         <w:pStyle w:val="Titre1"/>
@@ -669,6 +721,7 @@
       <w:bookmarkEnd w:id="8"/>
       <w:bookmarkEnd w:id="9"/>
       <w:r>
+        <w:lastRenderedPageBreak/>
         <w:t>Utilisation</w:t>
       </w:r>
       <w:bookmarkEnd w:id="10"/>
@@ -759,29 +812,6 @@
       <w:pPr>
         <w:ind w:left="360"/>
       </w:pPr>
-    </w:p>
-    <w:p>
-      <w:pPr>
-        <w:ind w:left="360"/>
-      </w:pPr>
-      <w:r>
-        <w:rPr>
-          <w:highlight w:val="yellow"/>
-        </w:rPr>
-        <w:t>Rien ne se passe ?</w:t>
-      </w:r>
-      <w:r>
-        <w:t xml:space="preserve"> </w:t>
-      </w:r>
-      <w:r>
-        <w:t xml:space="preserve"> </w:t>
-      </w:r>
-      <w:r>
-        <w:t>zoomer sur la couche</w:t>
-      </w:r>
-      <w:r>
-        <w:t xml:space="preserve"> (clic droit sur la couche)</w:t>
-      </w:r>
     </w:p>
     <w:p>
       <w:pPr>
@@ -1441,7 +1471,7 @@
 <w:numbering xmlns:wpc="http://schemas.microsoft.com/office/word/2010/wordprocessingCanvas" xmlns:cx="http://schemas.microsoft.com/office/drawing/2014/chartex" xmlns:cx1="http://schemas.microsoft.com/office/drawing/2015/9/8/chartex" xmlns:cx2="http://schemas.microsoft.com/office/drawing/2015/10/21/chartex" xmlns:cx3="http://schemas.microsoft.com/office/drawing/2016/5/9/chartex" xmlns:cx4="http://schemas.microsoft.com/office/drawing/2016/5/10/chartex" xmlns:cx5="http://schemas.microsoft.com/office/drawing/2016/5/11/chartex" xmlns:cx6="http://schemas.microsoft.com/office/drawing/2016/5/12/chartex" xmlns:cx7="http://schemas.microsoft.com/office/drawing/2016/5/13/chartex" xmlns:cx8="http://schemas.microsoft.com/office/drawing/2016/5/14/chartex" xmlns:mc="http://schemas.openxmlformats.org/markup-compatibility/2006" xmlns:aink="http://schemas.microsoft.com/office/drawing/2016/ink" xmlns:am3d="http://schemas.microsoft.com/office/drawing/2017/model3d" xmlns:o="urn:schemas-microsoft-com:office:office" xmlns:oel="http://schemas.microsoft.com/office/2019/extlst" xmlns:r="http://schemas.openxmlformats.org/officeDocument/2006/relationships" xmlns:m="http://schemas.openxmlformats.org/officeDocument/2006/math" xmlns:v="urn:schemas-microsoft-com:vml" xmlns:wp14="http://schemas.microsoft.com/office/word/2010/wordprocessingDrawing" xmlns:wp="http://schemas.openxmlformats.org/drawingml/2006/wordprocessingDrawing" xmlns:w10="urn:schemas-microsoft-com:office:word" xmlns:w="http://schemas.openxmlformats.org/wordprocessingml/2006/main" xmlns:w14="http://schemas.microsoft.com/office/word/2010/wordml" xmlns:w15="http://schemas.microsoft.com/office/word/2012/wordml" xmlns:w16cex="http://schemas.microsoft.com/office/word/2018/wordml/cex" xmlns:w16cid="http://schemas.microsoft.com/office/word/2016/wordml/cid" xmlns:w16="http://schemas.microsoft.com/office/word/2018/wordml" xmlns:w16du="http://schemas.microsoft.com/office/word/2023/wordml/word16du" xmlns:w16sdtdh="http://schemas.microsoft.com/office/word/2020/wordml/sdtdatahash" xmlns:w16sdtfl="http://schemas.microsoft.com/office/word/2024/wordml/sdtformatlock" xmlns:w16se="http://schemas.microsoft.com/office/word/2015/wordml/symex" xmlns:wpg="http://schemas.microsoft.com/office/word/2010/wordprocessingGroup" xmlns:wpi="http://schemas.microsoft.com/office/word/2010/wordprocessingInk" xmlns:wne="http://schemas.microsoft.com/office/word/2006/wordml" xmlns:wps="http://schemas.microsoft.com/office/word/2010/wordprocessingShape" mc:Ignorable="w14 w15 w16se w16cid w16 w16cex w16sdtdh w16sdtfl w16du wp14">
   <w:numPicBullet w:numPicBulletId="0">
     <w:pict>
-      <v:shapetype id="_x0000_t75" coordsize="21600,21600" o:spt="75" o:preferrelative="t" path="m@4@5l@4@11@9@11@9@5xe" filled="f" stroked="f">
+      <v:shapetype w14:anchorId="63DAF230" id="_x0000_t75" coordsize="21600,21600" o:spt="75" o:preferrelative="t" path="m@4@5l@4@11@9@11@9@5xe" filled="f" stroked="f">
         <v:stroke joinstyle="miter"/>
         <v:formulas>
           <v:f eqn="if lineDrawn pixelLineWidth 0"/>
@@ -1460,7 +1490,7 @@
         <v:path o:extrusionok="f" gradientshapeok="t" o:connecttype="rect"/>
         <o:lock v:ext="edit" aspectratio="t"/>
       </v:shapetype>
-      <v:shape id="_x0000_i1027" type="#_x0000_t75" style="width:30.75pt;height:52.5pt" o:bullet="t">
+      <v:shape id="_x0000_i1025" type="#_x0000_t75" style="width:30.75pt;height:52.5pt" o:bullet="t">
         <v:imagedata r:id="rId1" o:title="puce"/>
       </v:shape>
     </w:pict>
@@ -3457,6 +3487,118 @@
     </w:lvl>
   </w:abstractNum>
   <w:abstractNum w:abstractNumId="22" w15:restartNumberingAfterBreak="0">
+    <w:nsid w:val="4C3C64D8"/>
+    <w:multiLevelType w:val="hybridMultilevel"/>
+    <w:tmpl w:val="A6327DC2"/>
+    <w:lvl w:ilvl="0" w:tplc="FF66705A">
+      <w:numFmt w:val="bullet"/>
+      <w:lvlText w:val="-"/>
+      <w:lvlJc w:val="left"/>
+      <w:pPr>
+        <w:ind w:left="792" w:hanging="360"/>
+      </w:pPr>
+      <w:rPr>
+        <w:rFonts w:ascii="Arial" w:eastAsiaTheme="minorHAnsi" w:hAnsi="Arial" w:cs="Arial" w:hint="default"/>
+      </w:rPr>
+    </w:lvl>
+    <w:lvl w:ilvl="1" w:tplc="040C0003" w:tentative="1">
+      <w:start w:val="1"/>
+      <w:numFmt w:val="bullet"/>
+      <w:lvlText w:val="o"/>
+      <w:lvlJc w:val="left"/>
+      <w:pPr>
+        <w:ind w:left="1512" w:hanging="360"/>
+      </w:pPr>
+      <w:rPr>
+        <w:rFonts w:ascii="Courier New" w:hAnsi="Courier New" w:cs="Courier New" w:hint="default"/>
+      </w:rPr>
+    </w:lvl>
+    <w:lvl w:ilvl="2" w:tplc="040C0005" w:tentative="1">
+      <w:start w:val="1"/>
+      <w:numFmt w:val="bullet"/>
+      <w:lvlText w:val=""/>
+      <w:lvlJc w:val="left"/>
+      <w:pPr>
+        <w:ind w:left="2232" w:hanging="360"/>
+      </w:pPr>
+      <w:rPr>
+        <w:rFonts w:ascii="Wingdings" w:hAnsi="Wingdings" w:hint="default"/>
+      </w:rPr>
+    </w:lvl>
+    <w:lvl w:ilvl="3" w:tplc="040C0001" w:tentative="1">
+      <w:start w:val="1"/>
+      <w:numFmt w:val="bullet"/>
+      <w:lvlText w:val=""/>
+      <w:lvlJc w:val="left"/>
+      <w:pPr>
+        <w:ind w:left="2952" w:hanging="360"/>
+      </w:pPr>
+      <w:rPr>
+        <w:rFonts w:ascii="Symbol" w:hAnsi="Symbol" w:hint="default"/>
+      </w:rPr>
+    </w:lvl>
+    <w:lvl w:ilvl="4" w:tplc="040C0003" w:tentative="1">
+      <w:start w:val="1"/>
+      <w:numFmt w:val="bullet"/>
+      <w:lvlText w:val="o"/>
+      <w:lvlJc w:val="left"/>
+      <w:pPr>
+        <w:ind w:left="3672" w:hanging="360"/>
+      </w:pPr>
+      <w:rPr>
+        <w:rFonts w:ascii="Courier New" w:hAnsi="Courier New" w:cs="Courier New" w:hint="default"/>
+      </w:rPr>
+    </w:lvl>
+    <w:lvl w:ilvl="5" w:tplc="040C0005" w:tentative="1">
+      <w:start w:val="1"/>
+      <w:numFmt w:val="bullet"/>
+      <w:lvlText w:val=""/>
+      <w:lvlJc w:val="left"/>
+      <w:pPr>
+        <w:ind w:left="4392" w:hanging="360"/>
+      </w:pPr>
+      <w:rPr>
+        <w:rFonts w:ascii="Wingdings" w:hAnsi="Wingdings" w:hint="default"/>
+      </w:rPr>
+    </w:lvl>
+    <w:lvl w:ilvl="6" w:tplc="040C0001" w:tentative="1">
+      <w:start w:val="1"/>
+      <w:numFmt w:val="bullet"/>
+      <w:lvlText w:val=""/>
+      <w:lvlJc w:val="left"/>
+      <w:pPr>
+        <w:ind w:left="5112" w:hanging="360"/>
+      </w:pPr>
+      <w:rPr>
+        <w:rFonts w:ascii="Symbol" w:hAnsi="Symbol" w:hint="default"/>
+      </w:rPr>
+    </w:lvl>
+    <w:lvl w:ilvl="7" w:tplc="040C0003" w:tentative="1">
+      <w:start w:val="1"/>
+      <w:numFmt w:val="bullet"/>
+      <w:lvlText w:val="o"/>
+      <w:lvlJc w:val="left"/>
+      <w:pPr>
+        <w:ind w:left="5832" w:hanging="360"/>
+      </w:pPr>
+      <w:rPr>
+        <w:rFonts w:ascii="Courier New" w:hAnsi="Courier New" w:cs="Courier New" w:hint="default"/>
+      </w:rPr>
+    </w:lvl>
+    <w:lvl w:ilvl="8" w:tplc="040C0005" w:tentative="1">
+      <w:start w:val="1"/>
+      <w:numFmt w:val="bullet"/>
+      <w:lvlText w:val=""/>
+      <w:lvlJc w:val="left"/>
+      <w:pPr>
+        <w:ind w:left="6552" w:hanging="360"/>
+      </w:pPr>
+      <w:rPr>
+        <w:rFonts w:ascii="Wingdings" w:hAnsi="Wingdings" w:hint="default"/>
+      </w:rPr>
+    </w:lvl>
+  </w:abstractNum>
+  <w:abstractNum w:abstractNumId="23" w15:restartNumberingAfterBreak="0">
     <w:nsid w:val="4C3D1162"/>
     <w:multiLevelType w:val="hybridMultilevel"/>
     <w:tmpl w:val="771A7EA2"/>
@@ -3569,7 +3711,7 @@
       </w:rPr>
     </w:lvl>
   </w:abstractNum>
-  <w:abstractNum w:abstractNumId="23" w15:restartNumberingAfterBreak="0">
+  <w:abstractNum w:abstractNumId="24" w15:restartNumberingAfterBreak="0">
     <w:nsid w:val="4E887E10"/>
     <w:multiLevelType w:val="hybridMultilevel"/>
     <w:tmpl w:val="0B2AC3E4"/>
@@ -3683,7 +3825,7 @@
       </w:rPr>
     </w:lvl>
   </w:abstractNum>
-  <w:abstractNum w:abstractNumId="24" w15:restartNumberingAfterBreak="0">
+  <w:abstractNum w:abstractNumId="25" w15:restartNumberingAfterBreak="0">
     <w:nsid w:val="51A26798"/>
     <w:multiLevelType w:val="hybridMultilevel"/>
     <w:tmpl w:val="EC728E10"/>
@@ -3823,7 +3965,7 @@
       </w:rPr>
     </w:lvl>
   </w:abstractNum>
-  <w:abstractNum w:abstractNumId="25" w15:restartNumberingAfterBreak="0">
+  <w:abstractNum w:abstractNumId="26" w15:restartNumberingAfterBreak="0">
     <w:nsid w:val="5913664A"/>
     <w:multiLevelType w:val="hybridMultilevel"/>
     <w:tmpl w:val="DDB4F73A"/>
@@ -3938,7 +4080,7 @@
       </w:rPr>
     </w:lvl>
   </w:abstractNum>
-  <w:abstractNum w:abstractNumId="26" w15:restartNumberingAfterBreak="0">
+  <w:abstractNum w:abstractNumId="27" w15:restartNumberingAfterBreak="0">
     <w:nsid w:val="5A9D0866"/>
     <w:multiLevelType w:val="hybridMultilevel"/>
     <w:tmpl w:val="AA888CE2"/>
@@ -4053,7 +4195,7 @@
       </w:rPr>
     </w:lvl>
   </w:abstractNum>
-  <w:abstractNum w:abstractNumId="27" w15:restartNumberingAfterBreak="0">
+  <w:abstractNum w:abstractNumId="28" w15:restartNumberingAfterBreak="0">
     <w:nsid w:val="655259C8"/>
     <w:multiLevelType w:val="hybridMultilevel"/>
     <w:tmpl w:val="0FEE5AD8"/>
@@ -4167,7 +4309,7 @@
       </w:rPr>
     </w:lvl>
   </w:abstractNum>
-  <w:abstractNum w:abstractNumId="28" w15:restartNumberingAfterBreak="0">
+  <w:abstractNum w:abstractNumId="29" w15:restartNumberingAfterBreak="0">
     <w:nsid w:val="69FE70D9"/>
     <w:multiLevelType w:val="hybridMultilevel"/>
     <w:tmpl w:val="F2043FD8"/>
@@ -4282,7 +4424,7 @@
       </w:rPr>
     </w:lvl>
   </w:abstractNum>
-  <w:abstractNum w:abstractNumId="29" w15:restartNumberingAfterBreak="0">
+  <w:abstractNum w:abstractNumId="30" w15:restartNumberingAfterBreak="0">
     <w:nsid w:val="7379389B"/>
     <w:multiLevelType w:val="hybridMultilevel"/>
     <w:tmpl w:val="4702A67E"/>
@@ -4424,7 +4566,7 @@
       </w:rPr>
     </w:lvl>
   </w:abstractNum>
-  <w:abstractNum w:abstractNumId="30" w15:restartNumberingAfterBreak="0">
+  <w:abstractNum w:abstractNumId="31" w15:restartNumberingAfterBreak="0">
     <w:nsid w:val="7F1A4E6B"/>
     <w:multiLevelType w:val="hybridMultilevel"/>
     <w:tmpl w:val="59744A7E"/>
@@ -4540,13 +4682,13 @@
     </w:lvl>
   </w:abstractNum>
   <w:num w:numId="1" w16cid:durableId="1058551248">
-    <w:abstractNumId w:val="29"/>
+    <w:abstractNumId w:val="30"/>
   </w:num>
   <w:num w:numId="2" w16cid:durableId="524751361">
     <w:abstractNumId w:val="6"/>
   </w:num>
   <w:num w:numId="3" w16cid:durableId="43188818">
-    <w:abstractNumId w:val="24"/>
+    <w:abstractNumId w:val="25"/>
   </w:num>
   <w:num w:numId="4" w16cid:durableId="1104763316">
     <w:abstractNumId w:val="14"/>
@@ -4561,16 +4703,16 @@
     <w:abstractNumId w:val="10"/>
   </w:num>
   <w:num w:numId="8" w16cid:durableId="591740196">
-    <w:abstractNumId w:val="30"/>
+    <w:abstractNumId w:val="31"/>
   </w:num>
   <w:num w:numId="9" w16cid:durableId="840896619">
-    <w:abstractNumId w:val="28"/>
+    <w:abstractNumId w:val="29"/>
   </w:num>
   <w:num w:numId="10" w16cid:durableId="250510078">
     <w:abstractNumId w:val="21"/>
   </w:num>
   <w:num w:numId="11" w16cid:durableId="1126197374">
-    <w:abstractNumId w:val="27"/>
+    <w:abstractNumId w:val="28"/>
   </w:num>
   <w:num w:numId="12" w16cid:durableId="507602007">
     <w:abstractNumId w:val="8"/>
@@ -4579,7 +4721,7 @@
     <w:abstractNumId w:val="20"/>
   </w:num>
   <w:num w:numId="14" w16cid:durableId="1716856151">
-    <w:abstractNumId w:val="26"/>
+    <w:abstractNumId w:val="27"/>
   </w:num>
   <w:num w:numId="15" w16cid:durableId="336731093">
     <w:abstractNumId w:val="12"/>
@@ -4612,10 +4754,10 @@
     <w:abstractNumId w:val="15"/>
   </w:num>
   <w:num w:numId="25" w16cid:durableId="760838525">
-    <w:abstractNumId w:val="23"/>
+    <w:abstractNumId w:val="24"/>
   </w:num>
   <w:num w:numId="26" w16cid:durableId="2099399881">
-    <w:abstractNumId w:val="25"/>
+    <w:abstractNumId w:val="26"/>
   </w:num>
   <w:num w:numId="27" w16cid:durableId="1212571088">
     <w:abstractNumId w:val="10"/>
@@ -4678,13 +4820,16 @@
     <w:abstractNumId w:val="7"/>
   </w:num>
   <w:num w:numId="47" w16cid:durableId="477382913">
-    <w:abstractNumId w:val="22"/>
+    <w:abstractNumId w:val="23"/>
   </w:num>
   <w:num w:numId="48" w16cid:durableId="1093476300">
     <w:abstractNumId w:val="19"/>
   </w:num>
   <w:num w:numId="49" w16cid:durableId="961419367">
     <w:abstractNumId w:val="11"/>
+  </w:num>
+  <w:num w:numId="50" w16cid:durableId="1079907875">
+    <w:abstractNumId w:val="22"/>
   </w:num>
 </w:numbering>
 </file>
@@ -6617,6 +6762,16 @@
 </file>
 
 <file path=customXml/item1.xml><?xml version="1.0" encoding="utf-8"?>
+<p:properties xmlns:p="http://schemas.microsoft.com/office/2006/metadata/properties" xmlns:xsi="http://www.w3.org/2001/XMLSchema-instance" xmlns:pc="http://schemas.microsoft.com/office/infopath/2007/PartnerControls">
+  <documentManagement>
+    <lcf76f155ced4ddcb4097134ff3c332f xmlns="b295003c-aa87-407e-9024-fdee4e88f6fa">
+      <Terms xmlns="http://schemas.microsoft.com/office/infopath/2007/PartnerControls"/>
+    </lcf76f155ced4ddcb4097134ff3c332f>
+  </documentManagement>
+</p:properties>
+</file>
+
+<file path=customXml/item2.xml><?xml version="1.0" encoding="utf-8"?>
 <ct:contentTypeSchema xmlns:ct="http://schemas.microsoft.com/office/2006/metadata/contentType" xmlns:ma="http://schemas.microsoft.com/office/2006/metadata/properties/metaAttributes" ct:_="" ma:_="" ma:contentTypeName="Document" ma:contentTypeID="0x010100A3FA4CB5114F4B43B99F0B6DC8751D90" ma:contentTypeVersion="10" ma:contentTypeDescription="Crée un document." ma:contentTypeScope="" ma:versionID="501205be520febb413c56432ff8e6df1">
   <xsd:schema xmlns:xsd="http://www.w3.org/2001/XMLSchema" xmlns:xs="http://www.w3.org/2001/XMLSchema" xmlns:p="http://schemas.microsoft.com/office/2006/metadata/properties" xmlns:ns2="b295003c-aa87-407e-9024-fdee4e88f6fa" targetNamespace="http://schemas.microsoft.com/office/2006/metadata/properties" ma:root="true" ma:fieldsID="0378f5bf275aa5e8e5bb75b38d3da7db" ns2:_="">
     <xsd:import namespace="b295003c-aa87-407e-9024-fdee4e88f6fa"/>
@@ -6794,17 +6949,11 @@
 </ct:contentTypeSchema>
 </file>
 
-<file path=customXml/item2.xml><?xml version="1.0" encoding="utf-8"?>
-<p:properties xmlns:p="http://schemas.microsoft.com/office/2006/metadata/properties" xmlns:xsi="http://www.w3.org/2001/XMLSchema-instance" xmlns:pc="http://schemas.microsoft.com/office/infopath/2007/PartnerControls">
-  <documentManagement>
-    <lcf76f155ced4ddcb4097134ff3c332f xmlns="b295003c-aa87-407e-9024-fdee4e88f6fa">
-      <Terms xmlns="http://schemas.microsoft.com/office/infopath/2007/PartnerControls"/>
-    </lcf76f155ced4ddcb4097134ff3c332f>
-  </documentManagement>
-</p:properties>
+<file path=customXml/item3.xml><?xml version="1.0" encoding="utf-8"?>
+<b:Sources xmlns:b="http://schemas.openxmlformats.org/officeDocument/2006/bibliography" xmlns="http://schemas.openxmlformats.org/officeDocument/2006/bibliography" SelectedStyle="\APA.XSL" StyleName="APA"/>
 </file>
 
-<file path=customXml/item3.xml><?xml version="1.0" encoding="utf-8"?>
+<file path=customXml/item4.xml><?xml version="1.0" encoding="utf-8"?>
 <?mso-contentType ?>
 <FormTemplates xmlns="http://schemas.microsoft.com/sharepoint/v3/contenttype/forms">
   <Display>DocumentLibraryForm</Display>
@@ -6813,11 +6962,17 @@
 </FormTemplates>
 </file>
 
-<file path=customXml/item4.xml><?xml version="1.0" encoding="utf-8"?>
-<b:Sources xmlns:b="http://schemas.openxmlformats.org/officeDocument/2006/bibliography" xmlns="http://schemas.openxmlformats.org/officeDocument/2006/bibliography" SelectedStyle="\APA.XSL" StyleName="APA"/>
+<file path=customXml/itemProps1.xml><?xml version="1.0" encoding="utf-8"?>
+<ds:datastoreItem xmlns:ds="http://schemas.openxmlformats.org/officeDocument/2006/customXml" ds:itemID="{1159403A-C237-488E-8C5E-DABF9FCE7043}">
+  <ds:schemaRefs>
+    <ds:schemaRef ds:uri="http://schemas.microsoft.com/office/2006/metadata/properties"/>
+    <ds:schemaRef ds:uri="http://schemas.microsoft.com/office/infopath/2007/PartnerControls"/>
+    <ds:schemaRef ds:uri="b295003c-aa87-407e-9024-fdee4e88f6fa"/>
+  </ds:schemaRefs>
+</ds:datastoreItem>
 </file>
 
-<file path=customXml/itemProps1.xml><?xml version="1.0" encoding="utf-8"?>
+<file path=customXml/itemProps2.xml><?xml version="1.0" encoding="utf-8"?>
 <ds:datastoreItem xmlns:ds="http://schemas.openxmlformats.org/officeDocument/2006/customXml" ds:itemID="{15B44F83-286F-41C1-A87D-D9F5E51288E0}">
   <ds:schemaRefs>
     <ds:schemaRef ds:uri="http://schemas.microsoft.com/office/2006/metadata/contentType"/>
@@ -6835,28 +6990,18 @@
 </ds:datastoreItem>
 </file>
 
-<file path=customXml/itemProps2.xml><?xml version="1.0" encoding="utf-8"?>
-<ds:datastoreItem xmlns:ds="http://schemas.openxmlformats.org/officeDocument/2006/customXml" ds:itemID="{1159403A-C237-488E-8C5E-DABF9FCE7043}">
+<file path=customXml/itemProps3.xml><?xml version="1.0" encoding="utf-8"?>
+<ds:datastoreItem xmlns:ds="http://schemas.openxmlformats.org/officeDocument/2006/customXml" ds:itemID="{0FF0F878-5F0F-460C-9013-40E72731A637}">
   <ds:schemaRefs>
-    <ds:schemaRef ds:uri="http://schemas.microsoft.com/office/2006/metadata/properties"/>
-    <ds:schemaRef ds:uri="http://schemas.microsoft.com/office/infopath/2007/PartnerControls"/>
-    <ds:schemaRef ds:uri="b295003c-aa87-407e-9024-fdee4e88f6fa"/>
+    <ds:schemaRef ds:uri="http://schemas.openxmlformats.org/officeDocument/2006/bibliography"/>
   </ds:schemaRefs>
 </ds:datastoreItem>
 </file>
 
-<file path=customXml/itemProps3.xml><?xml version="1.0" encoding="utf-8"?>
+<file path=customXml/itemProps4.xml><?xml version="1.0" encoding="utf-8"?>
 <ds:datastoreItem xmlns:ds="http://schemas.openxmlformats.org/officeDocument/2006/customXml" ds:itemID="{EEE2973D-7DD7-4773-855D-5CAD81242BDE}">
   <ds:schemaRefs>
     <ds:schemaRef ds:uri="http://schemas.microsoft.com/sharepoint/v3/contenttype/forms"/>
   </ds:schemaRefs>
 </ds:datastoreItem>
-</file>
-
-<file path=customXml/itemProps4.xml><?xml version="1.0" encoding="utf-8"?>
-<ds:datastoreItem xmlns:ds="http://schemas.openxmlformats.org/officeDocument/2006/customXml" ds:itemID="{0FF0F878-5F0F-460C-9013-40E72731A637}">
-  <ds:schemaRefs>
-    <ds:schemaRef ds:uri="http://schemas.openxmlformats.org/officeDocument/2006/bibliography"/>
-  </ds:schemaRefs>
-</ds:datastoreItem>
 </file>
</xml_diff>